<commit_message>
Rerun R 4.5.3, folder with 2k5 results
</commit_message>
<xml_diff>
--- a/IncrCostsSim.docx
+++ b/IncrCostsSim.docx
@@ -15,7 +15,7 @@
         <w:pStyle w:val="Subtitle"/>
       </w:pPr>
       <w:r>
-        <w:t xml:space="preserve">Poisson-Gamma, Gaussian(identity), Gaussian(loglink), Gamma, and Zero-Inflated Gamma</w:t>
+        <w:t xml:space="preserve">Gaussian(identity), Gaussian(loglink), Gamma, and Zero-Inflated Gamma (Poisson-Gamma)</w:t>
       </w:r>
     </w:p>
     <w:p>
@@ -40,7 +40,7 @@
         <w:br/>
       </w:r>
       <w:r>
-        <w:t xml:space="preserve">Edited: 2025-10-29, Executed: 2025-10-29</w:t>
+        <w:t xml:space="preserve">Edited: 2026-03-25, Executed: 2026-03-25</w:t>
       </w:r>
     </w:p>
     <w:bookmarkStart w:id="20" w:name="conventions-and-packages"/>
@@ -61,13 +61,13 @@
       </w:r>
     </w:p>
     <w:bookmarkEnd w:id="20"/>
-    <w:bookmarkStart w:id="28" w:name="scneario"/>
+    <w:bookmarkStart w:id="28" w:name="scenario"/>
     <w:p>
       <w:pPr>
         <w:pStyle w:val="Heading2"/>
       </w:pPr>
       <w:r>
-        <w:t xml:space="preserve">Scneario</w:t>
+        <w:t xml:space="preserve">Scenario</w:t>
       </w:r>
     </w:p>
     <w:bookmarkStart w:id="21" w:name="population"/>
@@ -261,7 +261,7 @@
       <w:r>
         <w:drawing>
           <wp:inline>
-            <wp:extent cx="5334000" cy="3733800"/>
+            <wp:extent cx="5334000" cy="3733799"/>
             <wp:effectExtent b="0" l="0" r="0" t="0"/>
             <wp:docPr descr="" title="" id="30" name="Picture"/>
             <a:graphic>
@@ -282,7 +282,7 @@
                   <pic:spPr bwMode="auto">
                     <a:xfrm>
                       <a:off x="0" y="0"/>
-                      <a:ext cx="5334000" cy="3733800"/>
+                      <a:ext cx="5334000" cy="3733799"/>
                     </a:xfrm>
                     <a:prstGeom prst="rect">
                       <a:avLst/>
@@ -338,7 +338,6 @@
           <w:trHeight w:val="624" w:hRule="auto"/>
           <w:tblHeader/>
         </w:trPr>
-        header 1
         <w:tc>
           <w:tcPr>
             <w:tcBorders>
@@ -668,7 +667,6 @@
         <w:trPr>
           <w:trHeight w:val="581" w:hRule="auto"/>
         </w:trPr>
-        body 1
         <w:tc>
           <w:tcPr>
             <w:tcBorders>
@@ -998,7 +996,6 @@
         <w:trPr>
           <w:trHeight w:val="581" w:hRule="auto"/>
         </w:trPr>
-        body 2
         <w:tc>
           <w:tcPr>
             <w:tcBorders>
@@ -1328,7 +1325,6 @@
         <w:trPr>
           <w:trHeight w:val="600" w:hRule="auto"/>
         </w:trPr>
-        body 3
         <w:tc>
           <w:tcPr>
             <w:tcBorders>
@@ -1658,7 +1654,6 @@
         <w:trPr>
           <w:trHeight w:val="600" w:hRule="auto"/>
         </w:trPr>
-        body 4
         <w:tc>
           <w:tcPr>
             <w:tcBorders>
@@ -1988,7 +1983,6 @@
         <w:trPr>
           <w:trHeight w:val="607" w:hRule="auto"/>
         </w:trPr>
-        body 5
         <w:tc>
           <w:tcPr>
             <w:tcBorders>
@@ -2318,7 +2312,6 @@
         <w:trPr>
           <w:trHeight w:val="607" w:hRule="auto"/>
         </w:trPr>
-        body 6
         <w:tc>
           <w:tcPr>
             <w:tcBorders>
@@ -2648,7 +2641,6 @@
         <w:trPr>
           <w:trHeight w:val="607" w:hRule="auto"/>
         </w:trPr>
-        body 7
         <w:tc>
           <w:tcPr>
             <w:tcBorders>
@@ -2978,7 +2970,6 @@
         <w:trPr>
           <w:trHeight w:val="607" w:hRule="auto"/>
         </w:trPr>
-        body 8
         <w:tc>
           <w:tcPr>
             <w:tcBorders>
@@ -3308,7 +3299,6 @@
         <w:trPr>
           <w:trHeight w:val="577" w:hRule="auto"/>
         </w:trPr>
-        body 9
         <w:tc>
           <w:tcPr>
             <w:tcBorders>
@@ -3638,7 +3628,6 @@
         <w:trPr>
           <w:trHeight w:val="577" w:hRule="auto"/>
         </w:trPr>
-        body10
         <w:tc>
           <w:tcPr>
             <w:tcBorders>
@@ -3968,7 +3957,6 @@
         <w:trPr>
           <w:trHeight w:val="600" w:hRule="auto"/>
         </w:trPr>
-        body11
         <w:tc>
           <w:tcPr>
             <w:tcBorders>
@@ -4298,7 +4286,6 @@
         <w:trPr>
           <w:trHeight w:val="600" w:hRule="auto"/>
         </w:trPr>
-        body12
         <w:tc>
           <w:tcPr>
             <w:tcBorders>
@@ -4628,7 +4615,6 @@
         <w:trPr>
           <w:trHeight w:val="577" w:hRule="auto"/>
         </w:trPr>
-        body13
         <w:tc>
           <w:tcPr>
             <w:tcBorders>
@@ -4958,7 +4944,6 @@
         <w:trPr>
           <w:trHeight w:val="577" w:hRule="auto"/>
         </w:trPr>
-        body14
         <w:tc>
           <w:tcPr>
             <w:tcBorders>
@@ -5288,7 +5273,6 @@
         <w:trPr>
           <w:trHeight w:val="600" w:hRule="auto"/>
         </w:trPr>
-        body15
         <w:tc>
           <w:tcPr>
             <w:tcBorders>
@@ -5618,7 +5602,6 @@
         <w:trPr>
           <w:trHeight w:val="600" w:hRule="auto"/>
         </w:trPr>
-        body16
         <w:tc>
           <w:tcPr>
             <w:tcBorders>
@@ -5948,7 +5931,6 @@
         <w:trPr>
           <w:trHeight w:val="624" w:hRule="auto"/>
         </w:trPr>
-        body17
         <w:tc>
           <w:tcPr>
             <w:tcBorders>
@@ -6278,7 +6260,6 @@
         <w:trPr>
           <w:trHeight w:val="624" w:hRule="auto"/>
         </w:trPr>
-        body18
         <w:tc>
           <w:tcPr>
             <w:tcBorders>
@@ -6608,7 +6589,6 @@
         <w:trPr>
           <w:trHeight w:val="624" w:hRule="auto"/>
         </w:trPr>
-        body19
         <w:tc>
           <w:tcPr>
             <w:tcBorders>
@@ -6938,7 +6918,6 @@
         <w:trPr>
           <w:trHeight w:val="624" w:hRule="auto"/>
         </w:trPr>
-        body20
         <w:tc>
           <w:tcPr>
             <w:tcBorders>
@@ -7302,7 +7281,6 @@
           <w:trHeight w:val="624" w:hRule="auto"/>
           <w:tblHeader/>
         </w:trPr>
-        header 1
         <w:tc>
           <w:tcPr>
             <w:tcBorders>
@@ -7632,7 +7610,6 @@
         <w:trPr>
           <w:trHeight w:val="581" w:hRule="auto"/>
         </w:trPr>
-        body 1
         <w:tc>
           <w:tcPr>
             <w:tcBorders>
@@ -7845,7 +7822,7 @@
                 <w:szCs w:val="22"/>
                 <w:color w:val="000000"/>
               </w:rPr>
-              <w:t xml:space="preserve">23.01</w:t>
+              <w:t xml:space="preserve">22.94</w:t>
             </w:r>
           </w:p>
         </w:tc>
@@ -7962,7 +7939,6 @@
         <w:trPr>
           <w:trHeight w:val="581" w:hRule="auto"/>
         </w:trPr>
-        body 2
         <w:tc>
           <w:tcPr>
             <w:tcBorders>
@@ -8292,7 +8268,6 @@
         <w:trPr>
           <w:trHeight w:val="600" w:hRule="auto"/>
         </w:trPr>
-        body 3
         <w:tc>
           <w:tcPr>
             <w:tcBorders>
@@ -8622,7 +8597,6 @@
         <w:trPr>
           <w:trHeight w:val="600" w:hRule="auto"/>
         </w:trPr>
-        body 4
         <w:tc>
           <w:tcPr>
             <w:tcBorders>
@@ -8952,7 +8926,6 @@
         <w:trPr>
           <w:trHeight w:val="607" w:hRule="auto"/>
         </w:trPr>
-        body 5
         <w:tc>
           <w:tcPr>
             <w:tcBorders>
@@ -9282,7 +9255,6 @@
         <w:trPr>
           <w:trHeight w:val="607" w:hRule="auto"/>
         </w:trPr>
-        body 6
         <w:tc>
           <w:tcPr>
             <w:tcBorders>
@@ -9612,7 +9584,6 @@
         <w:trPr>
           <w:trHeight w:val="607" w:hRule="auto"/>
         </w:trPr>
-        body 7
         <w:tc>
           <w:tcPr>
             <w:tcBorders>
@@ -9942,7 +9913,6 @@
         <w:trPr>
           <w:trHeight w:val="607" w:hRule="auto"/>
         </w:trPr>
-        body 8
         <w:tc>
           <w:tcPr>
             <w:tcBorders>
@@ -10272,7 +10242,6 @@
         <w:trPr>
           <w:trHeight w:val="577" w:hRule="auto"/>
         </w:trPr>
-        body 9
         <w:tc>
           <w:tcPr>
             <w:tcBorders>
@@ -10485,7 +10454,7 @@
                 <w:szCs w:val="22"/>
                 <w:color w:val="000000"/>
               </w:rPr>
-              <w:t xml:space="preserve">314.46</w:t>
+              <w:t xml:space="preserve">314.49</w:t>
             </w:r>
           </w:p>
         </w:tc>
@@ -10602,7 +10571,6 @@
         <w:trPr>
           <w:trHeight w:val="577" w:hRule="auto"/>
         </w:trPr>
-        body10
         <w:tc>
           <w:tcPr>
             <w:tcBorders>
@@ -10932,7 +10900,6 @@
         <w:trPr>
           <w:trHeight w:val="600" w:hRule="auto"/>
         </w:trPr>
-        body11
         <w:tc>
           <w:tcPr>
             <w:tcBorders>
@@ -11262,7 +11229,6 @@
         <w:trPr>
           <w:trHeight w:val="600" w:hRule="auto"/>
         </w:trPr>
-        body12
         <w:tc>
           <w:tcPr>
             <w:tcBorders>
@@ -11592,7 +11558,6 @@
         <w:trPr>
           <w:trHeight w:val="577" w:hRule="auto"/>
         </w:trPr>
-        body13
         <w:tc>
           <w:tcPr>
             <w:tcBorders>
@@ -11805,7 +11770,7 @@
                 <w:szCs w:val="22"/>
                 <w:color w:val="000000"/>
               </w:rPr>
-              <w:t xml:space="preserve">401.15</w:t>
+              <w:t xml:space="preserve">401.17</w:t>
             </w:r>
           </w:p>
         </w:tc>
@@ -11922,7 +11887,6 @@
         <w:trPr>
           <w:trHeight w:val="577" w:hRule="auto"/>
         </w:trPr>
-        body14
         <w:tc>
           <w:tcPr>
             <w:tcBorders>
@@ -12252,7 +12216,6 @@
         <w:trPr>
           <w:trHeight w:val="600" w:hRule="auto"/>
         </w:trPr>
-        body15
         <w:tc>
           <w:tcPr>
             <w:tcBorders>
@@ -12582,7 +12545,6 @@
         <w:trPr>
           <w:trHeight w:val="600" w:hRule="auto"/>
         </w:trPr>
-        body16
         <w:tc>
           <w:tcPr>
             <w:tcBorders>
@@ -12912,7 +12874,6 @@
         <w:trPr>
           <w:trHeight w:val="624" w:hRule="auto"/>
         </w:trPr>
-        body17
         <w:tc>
           <w:tcPr>
             <w:tcBorders>
@@ -13242,7 +13203,6 @@
         <w:trPr>
           <w:trHeight w:val="624" w:hRule="auto"/>
         </w:trPr>
-        body18
         <w:tc>
           <w:tcPr>
             <w:tcBorders>
@@ -13572,7 +13532,6 @@
         <w:trPr>
           <w:trHeight w:val="624" w:hRule="auto"/>
         </w:trPr>
-        body19
         <w:tc>
           <w:tcPr>
             <w:tcBorders>
@@ -13902,7 +13861,6 @@
         <w:trPr>
           <w:trHeight w:val="624" w:hRule="auto"/>
         </w:trPr>
-        body20
         <w:tc>
           <w:tcPr>
             <w:tcBorders>

</xml_diff>